<commit_message>
Rebuild manuscript on R1 frame (keep VAI identity + structure; weave in passage validation, behavioral criterion validity, procurement); reconcile cover+response letters to R1 frame; abstract to 249w; fix MOHURD attribution
Co-Authored-By: Claude Opus 4.8 (1M context) <noreply@anthropic.com>
</commit_message>
<xml_diff>
--- a/05-manuscript/submission/cover_letter_jcss.docx
+++ b/05-manuscript/submission/cover_letter_jcss.docx
@@ -129,7 +129,7 @@
           <w:b/>
           <w:bCs/>
         </w:rPr>
-        <w:t xml:space="preserve">What the paper now is.</w:t>
+        <w:t xml:space="preserve">What the revision does.</w:t>
       </w:r>
       <w:r>
         <w:t xml:space="preserve"> </w:t>
@@ -164,20 +164,36 @@
         <w:t xml:space="preserve">visibility bias</w:t>
       </w:r>
       <w:r>
-        <w:t xml:space="preserve">, and overclaimed. We have reconceived the work as a</w:t>
-      </w:r>
-      <w:r>
-        <w:t xml:space="preserve"> </w:t>
-      </w:r>
-      <w:r>
-        <w:rPr>
-          <w:b/>
-          <w:bCs/>
-        </w:rPr>
-        <w:t xml:space="preserve">study in validating dictionary text-as-data measures</w:t>
-      </w:r>
-      <w:r>
-        <w:t xml:space="preserve">, using visibility bias in Chinese municipal government work reports (6,294 reports, 282 prefectures, 2002–2024) as the case. The contribution is methodological and, we believe, of direct interest to JCSS’s readership:</w:t>
+        <w:t xml:space="preserve">, and overclaimed. We have</w:t>
+      </w:r>
+      <w:r>
+        <w:t xml:space="preserve"> </w:t>
+      </w:r>
+      <w:r>
+        <w:rPr>
+          <w:b/>
+          <w:bCs/>
+        </w:rPr>
+        <w:t xml:space="preserve">kept the Visibility Attention Index (VAI) as the paper’s instrument and kept its structure</w:t>
+      </w:r>
+      <w:r>
+        <w:t xml:space="preserve">, and used your comments to</w:t>
+      </w:r>
+      <w:r>
+        <w:t xml:space="preserve"> </w:t>
+      </w:r>
+      <w:r>
+        <w:rPr>
+          <w:b/>
+          <w:bCs/>
+        </w:rPr>
+        <w:t xml:space="preserve">strengthen the validation and narrow the claims</w:t>
+      </w:r>
+      <w:r>
+        <w:t xml:space="preserve"> </w:t>
+      </w:r>
+      <w:r>
+        <w:t xml:space="preserve">— the paper a reviewer reads is the same one, much better evidenced. Applied to 6,294 Chinese municipal government work reports (282 prefectures, 2002–2024), the contribution remains methodological and, we believe, of direct interest to JCSS’s readership:</w:t>
       </w:r>
     </w:p>
     <w:p>
@@ -458,7 +474,7 @@
         </w:r>
       </w:hyperlink>
       <w:r>
-        <w:t xml:space="preserve">. Replication archive (instrument, gold-standard codings, all analysis and re-pull code, procurement classification, deviation log): Zenodo DOI</w:t>
+        <w:t xml:space="preserve">. Replication archive (instrument, gold-standard codings, all analysis and re-pull code, procurement classification, deviation log): Zenodo concept DOI</w:t>
       </w:r>
       <w:r>
         <w:t xml:space="preserve"> </w:t>
@@ -472,7 +488,10 @@
         </w:r>
       </w:hyperlink>
       <w:r>
-        <w:t xml:space="preserve">, mirrored at GitHub (</w:t>
+        <w:t xml:space="preserve"> </w:t>
+      </w:r>
+      <w:r>
+        <w:t xml:space="preserve">(always resolving to the latest version), mirrored at GitHub (</w:t>
       </w:r>
       <w:r>
         <w:rPr>
@@ -481,7 +500,36 @@
         <w:t xml:space="preserve">andyhsi2023-cq/visibility-bias-v2</w:t>
       </w:r>
       <w:r>
-        <w:t xml:space="preserve">). We are re-depositing and verifying that every link resolves (the reviewer reported they did not) and will provide a fresh reviewer-access token to the editorial office.</w:t>
+        <w:t xml:space="preserve">). We have re-deposited and verified that every link resolves: the Zenodo record is now</w:t>
+      </w:r>
+      <w:r>
+        <w:t xml:space="preserve"> </w:t>
+      </w:r>
+      <w:r>
+        <w:rPr>
+          <w:b/>
+          <w:bCs/>
+        </w:rPr>
+        <w:t xml:space="preserve">open access</w:t>
+      </w:r>
+      <w:r>
+        <w:t xml:space="preserve"> </w:t>
+      </w:r>
+      <w:r>
+        <w:t xml:space="preserve">and the GitHub mirror is</w:t>
+      </w:r>
+      <w:r>
+        <w:t xml:space="preserve"> </w:t>
+      </w:r>
+      <w:r>
+        <w:rPr>
+          <w:b/>
+          <w:bCs/>
+        </w:rPr>
+        <w:t xml:space="preserve">live and public</w:t>
+      </w:r>
+      <w:r>
+        <w:t xml:space="preserve">. We apologize that the original record was not accessible to the reviewer and have corrected it.</w:t>
       </w:r>
     </w:p>
     <w:p>
@@ -515,7 +563,7 @@
         <w:t xml:space="preserve"> </w:t>
       </w:r>
       <w:r>
-        <w:t xml:space="preserve">in this paper (the §3.4 ensemble), documented and reproducible; separately, the authors used an LLM for copy-editing only. All substantive content and conclusions are the authors’ own.</w:t>
+        <w:t xml:space="preserve">in this paper (the §3.2.0 ensemble), documented and reproducible; separately, the authors used an LLM for copy-editing only. All substantive content and conclusions are the authors’ own.</w:t>
       </w:r>
     </w:p>
     <w:p>

</xml_diff>

<commit_message>
Author change: remove Zhihui Li (3rd author); two authors only (Xi + Liu Can); reattribute second passage-coding to Liu Can across manuscript/title-page/ESM/cover/response/REPLICATION; regenerate DOCX
Co-Authored-By: Claude Opus 4.8 (1M context) <noreply@anthropic.com>
</commit_message>
<xml_diff>
--- a/05-manuscript/submission/cover_letter_jcss.docx
+++ b/05-manuscript/submission/cover_letter_jcss.docx
@@ -379,7 +379,7 @@
         <w:t xml:space="preserve"> </w:t>
       </w:r>
       <w:r>
-        <w:t xml:space="preserve">Since the original submission we have added two coauthors whose work answers needs the review surfaced:</w:t>
+        <w:t xml:space="preserve">Since the original submission we have added a coauthor whose work answers needs the review surfaced:</w:t>
       </w:r>
       <w:r>
         <w:t xml:space="preserve"> </w:t>
@@ -395,23 +395,7 @@
         <w:t xml:space="preserve"> </w:t>
       </w:r>
       <w:r>
-        <w:t xml:space="preserve">(co-first; urban &amp; rural planning) built and verified the procurement-classification scheme, and</w:t>
-      </w:r>
-      <w:r>
-        <w:t xml:space="preserve"> </w:t>
-      </w:r>
-      <w:r>
-        <w:rPr>
-          <w:b/>
-          <w:bCs/>
-        </w:rPr>
-        <w:t xml:space="preserve">Zhihui Li</w:t>
-      </w:r>
-      <w:r>
-        <w:t xml:space="preserve"> </w:t>
-      </w:r>
-      <w:r>
-        <w:t xml:space="preserve">provided the independent second coding behind the intercoder agreement. Contributions follow ICMJE and are listed in the Statements.</w:t>
+        <w:t xml:space="preserve">(co-first; urban &amp; rural planning) built and verified the procurement-classification scheme (Section 4.3) and provided the independent second coding behind the intercoder agreement. Contributions follow ICMJE and are listed in the Statements.</w:t>
       </w:r>
     </w:p>
     <w:p>
@@ -609,7 +593,7 @@
         <w:t xml:space="preserve"> </w:t>
       </w:r>
       <w:r>
-        <w:t xml:space="preserve">(corresponding author), on behalf of all authors — Hongyang Xi and Liu Can (co-first) and Zhihui Li</w:t>
+        <w:t xml:space="preserve">(corresponding author), on behalf of both authors — Hongyang Xi and Liu Can (co-first authors)</w:t>
       </w:r>
       <w:r>
         <w:t xml:space="preserve"> </w:t>

</xml_diff>